<commit_message>
feat: :sparkles: Proposed model trained nicely surpassing all baseline model in comparative analysis
</commit_message>
<xml_diff>
--- a/docs/hmt-tsf.docx
+++ b/docs/hmt-tsf.docx
@@ -477,55 +477,91 @@
           <w:tcPr>
             <w:tcW w:w="1283" w:type="dxa"/>
           </w:tcPr>
-          <w:p/>
+          <w:p>
+            <w:r>
+              <w:t>77.28</w:t>
+            </w:r>
+          </w:p>
         </w:tc>
         <w:tc>
           <w:tcPr>
             <w:tcW w:w="1183" w:type="dxa"/>
           </w:tcPr>
-          <w:p/>
+          <w:p>
+            <w:r>
+              <w:t>6.82</w:t>
+            </w:r>
+          </w:p>
         </w:tc>
         <w:tc>
           <w:tcPr>
             <w:tcW w:w="1207" w:type="dxa"/>
           </w:tcPr>
-          <w:p/>
+          <w:p>
+            <w:r>
+              <w:t>6.16</w:t>
+            </w:r>
+          </w:p>
         </w:tc>
         <w:tc>
           <w:tcPr>
             <w:tcW w:w="1240" w:type="dxa"/>
           </w:tcPr>
-          <w:p/>
+          <w:p>
+            <w:r>
+              <w:t>9.74</w:t>
+            </w:r>
+          </w:p>
         </w:tc>
         <w:tc>
           <w:tcPr>
             <w:tcW w:w="1390" w:type="dxa"/>
           </w:tcPr>
-          <w:p/>
+          <w:p>
+            <w:r>
+              <w:t>77,346</w:t>
+            </w:r>
+          </w:p>
         </w:tc>
         <w:tc>
           <w:tcPr>
             <w:tcW w:w="1390" w:type="dxa"/>
           </w:tcPr>
-          <w:p/>
+          <w:p>
+            <w:r>
+              <w:t>122,290</w:t>
+            </w:r>
+          </w:p>
         </w:tc>
         <w:tc>
           <w:tcPr>
             <w:tcW w:w="1154" w:type="dxa"/>
           </w:tcPr>
-          <w:p/>
+          <w:p>
+            <w:r>
+              <w:t>0.7171</w:t>
+            </w:r>
+          </w:p>
         </w:tc>
         <w:tc>
           <w:tcPr>
             <w:tcW w:w="1545" w:type="dxa"/>
           </w:tcPr>
-          <w:p/>
+          <w:p>
+            <w:r>
+              <w:t>+42.49</w:t>
+            </w:r>
+          </w:p>
         </w:tc>
         <w:tc>
           <w:tcPr>
             <w:tcW w:w="2060" w:type="dxa"/>
           </w:tcPr>
-          <w:p/>
+          <w:p>
+            <w:r>
+              <w:t>+14.09</w:t>
+            </w:r>
+          </w:p>
         </w:tc>
       </w:tr>
     </w:tbl>
@@ -1015,55 +1051,91 @@
           <w:tcPr>
             <w:tcW w:w="1283" w:type="dxa"/>
           </w:tcPr>
-          <w:p/>
+          <w:p>
+            <w:r>
+              <w:t>80.04</w:t>
+            </w:r>
+          </w:p>
         </w:tc>
         <w:tc>
           <w:tcPr>
             <w:tcW w:w="1183" w:type="dxa"/>
           </w:tcPr>
-          <w:p/>
+          <w:p>
+            <w:r>
+              <w:t>6.00</w:t>
+            </w:r>
+          </w:p>
         </w:tc>
         <w:tc>
           <w:tcPr>
             <w:tcW w:w="1207" w:type="dxa"/>
           </w:tcPr>
-          <w:p/>
+          <w:p>
+            <w:r>
+              <w:t>5.42</w:t>
+            </w:r>
+          </w:p>
         </w:tc>
         <w:tc>
           <w:tcPr>
             <w:tcW w:w="1240" w:type="dxa"/>
           </w:tcPr>
-          <w:p/>
+          <w:p>
+            <w:r>
+              <w:t>8.54</w:t>
+            </w:r>
+          </w:p>
         </w:tc>
         <w:tc>
           <w:tcPr>
             <w:tcW w:w="1390" w:type="dxa"/>
           </w:tcPr>
-          <w:p/>
+          <w:p>
+            <w:r>
+              <w:t>68,120</w:t>
+            </w:r>
+          </w:p>
         </w:tc>
         <w:tc>
           <w:tcPr>
             <w:tcW w:w="1390" w:type="dxa"/>
           </w:tcPr>
-          <w:p/>
+          <w:p>
+            <w:r>
+              <w:t>107,319</w:t>
+            </w:r>
+          </w:p>
         </w:tc>
         <w:tc>
           <w:tcPr>
             <w:tcW w:w="1154" w:type="dxa"/>
           </w:tcPr>
-          <w:p/>
+          <w:p>
+            <w:r>
+              <w:t>0.7829</w:t>
+            </w:r>
+          </w:p>
         </w:tc>
         <w:tc>
           <w:tcPr>
             <w:tcW w:w="1545" w:type="dxa"/>
           </w:tcPr>
-          <w:p/>
+          <w:p>
+            <w:r>
+              <w:t>+45.21</w:t>
+            </w:r>
+          </w:p>
         </w:tc>
         <w:tc>
           <w:tcPr>
             <w:tcW w:w="2060" w:type="dxa"/>
           </w:tcPr>
-          <w:p/>
+          <w:p>
+            <w:r>
+              <w:t>+14.90</w:t>
+            </w:r>
+          </w:p>
         </w:tc>
       </w:tr>
     </w:tbl>
@@ -1553,55 +1625,91 @@
           <w:tcPr>
             <w:tcW w:w="1283" w:type="dxa"/>
           </w:tcPr>
-          <w:p/>
+          <w:p>
+            <w:r>
+              <w:t>79.07</w:t>
+            </w:r>
+          </w:p>
         </w:tc>
         <w:tc>
           <w:tcPr>
             <w:tcW w:w="1183" w:type="dxa"/>
           </w:tcPr>
-          <w:p/>
+          <w:p>
+            <w:r>
+              <w:t>6.21</w:t>
+            </w:r>
+          </w:p>
         </w:tc>
         <w:tc>
           <w:tcPr>
             <w:tcW w:w="1207" w:type="dxa"/>
           </w:tcPr>
-          <w:p/>
+          <w:p>
+            <w:r>
+              <w:t>5.67</w:t>
+            </w:r>
+          </w:p>
         </w:tc>
         <w:tc>
           <w:tcPr>
             <w:tcW w:w="1240" w:type="dxa"/>
           </w:tcPr>
-          <w:p/>
+          <w:p>
+            <w:r>
+              <w:t>9.05</w:t>
+            </w:r>
+          </w:p>
         </w:tc>
         <w:tc>
           <w:tcPr>
             <w:tcW w:w="1390" w:type="dxa"/>
           </w:tcPr>
-          <w:p/>
+          <w:p>
+            <w:r>
+              <w:t>71,313</w:t>
+            </w:r>
+          </w:p>
         </w:tc>
         <w:tc>
           <w:tcPr>
             <w:tcW w:w="1390" w:type="dxa"/>
           </w:tcPr>
-          <w:p/>
+          <w:p>
+            <w:r>
+              <w:t>113,815</w:t>
+            </w:r>
+          </w:p>
         </w:tc>
         <w:tc>
           <w:tcPr>
             <w:tcW w:w="1154" w:type="dxa"/>
           </w:tcPr>
-          <w:p/>
+          <w:p>
+            <w:r>
+              <w:t>0.7561</w:t>
+            </w:r>
+          </w:p>
         </w:tc>
         <w:tc>
           <w:tcPr>
             <w:tcW w:w="1545" w:type="dxa"/>
           </w:tcPr>
-          <w:p/>
+          <w:p>
+            <w:r>
+              <w:t>+44.43</w:t>
+            </w:r>
+          </w:p>
         </w:tc>
         <w:tc>
           <w:tcPr>
             <w:tcW w:w="2060" w:type="dxa"/>
           </w:tcPr>
-          <w:p/>
+          <w:p>
+            <w:r>
+              <w:t>+14.76</w:t>
+            </w:r>
+          </w:p>
         </w:tc>
       </w:tr>
     </w:tbl>
@@ -2093,55 +2201,91 @@
           <w:tcPr>
             <w:tcW w:w="1283" w:type="dxa"/>
           </w:tcPr>
-          <w:p/>
+          <w:p>
+            <w:r>
+              <w:t>77.57</w:t>
+            </w:r>
+          </w:p>
         </w:tc>
         <w:tc>
           <w:tcPr>
             <w:tcW w:w="1183" w:type="dxa"/>
           </w:tcPr>
-          <w:p/>
+          <w:p>
+            <w:r>
+              <w:t>6.85</w:t>
+            </w:r>
+          </w:p>
         </w:tc>
         <w:tc>
           <w:tcPr>
             <w:tcW w:w="1207" w:type="dxa"/>
           </w:tcPr>
-          <w:p/>
+          <w:p>
+            <w:r>
+              <w:t>6.13</w:t>
+            </w:r>
+          </w:p>
         </w:tc>
         <w:tc>
           <w:tcPr>
             <w:tcW w:w="1240" w:type="dxa"/>
           </w:tcPr>
-          <w:p/>
+          <w:p>
+            <w:r>
+              <w:t>9.44</w:t>
+            </w:r>
+          </w:p>
         </w:tc>
         <w:tc>
           <w:tcPr>
             <w:tcW w:w="1390" w:type="dxa"/>
           </w:tcPr>
-          <w:p/>
+          <w:p>
+            <w:r>
+              <w:t>77,006</w:t>
+            </w:r>
+          </w:p>
         </w:tc>
         <w:tc>
           <w:tcPr>
             <w:tcW w:w="1390" w:type="dxa"/>
           </w:tcPr>
-          <w:p/>
+          <w:p>
+            <w:r>
+              <w:t>118,544</w:t>
+            </w:r>
+          </w:p>
         </w:tc>
         <w:tc>
           <w:tcPr>
             <w:tcW w:w="1154" w:type="dxa"/>
           </w:tcPr>
-          <w:p/>
+          <w:p>
+            <w:r>
+              <w:t>0.7319</w:t>
+            </w:r>
+          </w:p>
         </w:tc>
         <w:tc>
           <w:tcPr>
             <w:tcW w:w="1545" w:type="dxa"/>
           </w:tcPr>
-          <w:p/>
+          <w:p>
+            <w:r>
+              <w:t>+42.58</w:t>
+            </w:r>
+          </w:p>
         </w:tc>
         <w:tc>
           <w:tcPr>
             <w:tcW w:w="2060" w:type="dxa"/>
           </w:tcPr>
-          <w:p/>
+          <w:p>
+            <w:r>
+              <w:t>+14.02</w:t>
+            </w:r>
+          </w:p>
         </w:tc>
       </w:tr>
     </w:tbl>
@@ -2631,55 +2775,91 @@
           <w:tcPr>
             <w:tcW w:w="1283" w:type="dxa"/>
           </w:tcPr>
-          <w:p/>
+          <w:p>
+            <w:r>
+              <w:t>78.89</w:t>
+            </w:r>
+          </w:p>
         </w:tc>
         <w:tc>
           <w:tcPr>
             <w:tcW w:w="1183" w:type="dxa"/>
           </w:tcPr>
-          <w:p/>
+          <w:p>
+            <w:r>
+              <w:t>6.30</w:t>
+            </w:r>
+          </w:p>
         </w:tc>
         <w:tc>
           <w:tcPr>
             <w:tcW w:w="1207" w:type="dxa"/>
           </w:tcPr>
-          <w:p/>
+          <w:p>
+            <w:r>
+              <w:t>5.41</w:t>
+            </w:r>
+          </w:p>
         </w:tc>
         <w:tc>
           <w:tcPr>
             <w:tcW w:w="1240" w:type="dxa"/>
           </w:tcPr>
-          <w:p/>
+          <w:p>
+            <w:r>
+              <w:t>9.41</w:t>
+            </w:r>
+          </w:p>
         </w:tc>
         <w:tc>
           <w:tcPr>
             <w:tcW w:w="1390" w:type="dxa"/>
           </w:tcPr>
-          <w:p/>
+          <w:p>
+            <w:r>
+              <w:t>67,454</w:t>
+            </w:r>
+          </w:p>
         </w:tc>
         <w:tc>
           <w:tcPr>
             <w:tcW w:w="1390" w:type="dxa"/>
           </w:tcPr>
-          <w:p/>
+          <w:p>
+            <w:r>
+              <w:t>117,216</w:t>
+            </w:r>
+          </w:p>
         </w:tc>
         <w:tc>
           <w:tcPr>
             <w:tcW w:w="1154" w:type="dxa"/>
           </w:tcPr>
-          <w:p/>
+          <w:p>
+            <w:r>
+              <w:t>0.7365</w:t>
+            </w:r>
+          </w:p>
         </w:tc>
         <w:tc>
           <w:tcPr>
             <w:tcW w:w="1545" w:type="dxa"/>
           </w:tcPr>
-          <w:p/>
+          <w:p>
+            <w:r>
+              <w:t>+44.67</w:t>
+            </w:r>
+          </w:p>
         </w:tc>
         <w:tc>
           <w:tcPr>
             <w:tcW w:w="2060" w:type="dxa"/>
           </w:tcPr>
-          <w:p/>
+          <w:p>
+            <w:r>
+              <w:t>+14.86</w:t>
+            </w:r>
+          </w:p>
         </w:tc>
       </w:tr>
     </w:tbl>
@@ -3156,55 +3336,91 @@
           <w:tcPr>
             <w:tcW w:w="1283" w:type="dxa"/>
           </w:tcPr>
-          <w:p/>
+          <w:p>
+            <w:r>
+              <w:t>74.69</w:t>
+            </w:r>
+          </w:p>
         </w:tc>
         <w:tc>
           <w:tcPr>
             <w:tcW w:w="1183" w:type="dxa"/>
           </w:tcPr>
-          <w:p/>
+          <w:p>
+            <w:r>
+              <w:t>7.66</w:t>
+            </w:r>
+          </w:p>
         </w:tc>
         <w:tc>
           <w:tcPr>
             <w:tcW w:w="1207" w:type="dxa"/>
           </w:tcPr>
-          <w:p/>
+          <w:p>
+            <w:r>
+              <w:t>6.91</w:t>
+            </w:r>
+          </w:p>
         </w:tc>
         <w:tc>
           <w:tcPr>
             <w:tcW w:w="1240" w:type="dxa"/>
           </w:tcPr>
-          <w:p/>
+          <w:p>
+            <w:r>
+              <w:t>10.74</w:t>
+            </w:r>
+          </w:p>
         </w:tc>
         <w:tc>
           <w:tcPr>
             <w:tcW w:w="1390" w:type="dxa"/>
           </w:tcPr>
-          <w:p/>
+          <w:p>
+            <w:r>
+              <w:t>85,060</w:t>
+            </w:r>
+          </w:p>
         </w:tc>
         <w:tc>
           <w:tcPr>
             <w:tcW w:w="1390" w:type="dxa"/>
           </w:tcPr>
-          <w:p/>
+          <w:p>
+            <w:r>
+              <w:t>132,236</w:t>
+            </w:r>
+          </w:p>
         </w:tc>
         <w:tc>
           <w:tcPr>
             <w:tcW w:w="1154" w:type="dxa"/>
           </w:tcPr>
-          <w:p/>
+          <w:p>
+            <w:r>
+              <w:t>0.6829</w:t>
+            </w:r>
+          </w:p>
         </w:tc>
         <w:tc>
           <w:tcPr>
             <w:tcW w:w="1545" w:type="dxa"/>
           </w:tcPr>
-          <w:p/>
+          <w:p>
+            <w:r>
+              <w:t>+48.96</w:t>
+            </w:r>
+          </w:p>
         </w:tc>
         <w:tc>
           <w:tcPr>
             <w:tcW w:w="2060" w:type="dxa"/>
           </w:tcPr>
-          <w:p/>
+          <w:p>
+            <w:r>
+              <w:t>+16.94</w:t>
+            </w:r>
+          </w:p>
         </w:tc>
       </w:tr>
     </w:tbl>
@@ -3683,55 +3899,91 @@
           <w:tcPr>
             <w:tcW w:w="1283" w:type="dxa"/>
           </w:tcPr>
-          <w:p/>
+          <w:p>
+            <w:r>
+              <w:t>75.84</w:t>
+            </w:r>
+          </w:p>
         </w:tc>
         <w:tc>
           <w:tcPr>
             <w:tcW w:w="1183" w:type="dxa"/>
           </w:tcPr>
-          <w:p/>
+          <w:p>
+            <w:r>
+              <w:t>7.44</w:t>
+            </w:r>
+          </w:p>
         </w:tc>
         <w:tc>
           <w:tcPr>
             <w:tcW w:w="1207" w:type="dxa"/>
           </w:tcPr>
-          <w:p/>
+          <w:p>
+            <w:r>
+              <w:t>6.59</w:t>
+            </w:r>
+          </w:p>
         </w:tc>
         <w:tc>
           <w:tcPr>
             <w:tcW w:w="1240" w:type="dxa"/>
           </w:tcPr>
-          <w:p/>
+          <w:p>
+            <w:r>
+              <w:t>10.12</w:t>
+            </w:r>
+          </w:p>
         </w:tc>
         <w:tc>
           <w:tcPr>
             <w:tcW w:w="1390" w:type="dxa"/>
           </w:tcPr>
-          <w:p/>
+          <w:p>
+            <w:r>
+              <w:t>81,327</w:t>
+            </w:r>
+          </w:p>
         </w:tc>
         <w:tc>
           <w:tcPr>
             <w:tcW w:w="1390" w:type="dxa"/>
           </w:tcPr>
-          <w:p/>
+          <w:p>
+            <w:r>
+              <w:t>124,776</w:t>
+            </w:r>
+          </w:p>
         </w:tc>
         <w:tc>
           <w:tcPr>
             <w:tcW w:w="1154" w:type="dxa"/>
           </w:tcPr>
-          <w:p/>
+          <w:p>
+            <w:r>
+              <w:t>0.7188</w:t>
+            </w:r>
+          </w:p>
         </w:tc>
         <w:tc>
           <w:tcPr>
             <w:tcW w:w="1545" w:type="dxa"/>
           </w:tcPr>
-          <w:p/>
+          <w:p>
+            <w:r>
+              <w:t>+50.23</w:t>
+            </w:r>
+          </w:p>
         </w:tc>
         <w:tc>
           <w:tcPr>
             <w:tcW w:w="2060" w:type="dxa"/>
           </w:tcPr>
-          <w:p/>
+          <w:p>
+            <w:r>
+              <w:t>+17.21</w:t>
+            </w:r>
+          </w:p>
         </w:tc>
       </w:tr>
     </w:tbl>
@@ -4208,55 +4460,91 @@
           <w:tcPr>
             <w:tcW w:w="1283" w:type="dxa"/>
           </w:tcPr>
-          <w:p/>
+          <w:p>
+            <w:r>
+              <w:t>76.75</w:t>
+            </w:r>
+          </w:p>
         </w:tc>
         <w:tc>
           <w:tcPr>
             <w:tcW w:w="1183" w:type="dxa"/>
           </w:tcPr>
-          <w:p/>
+          <w:p>
+            <w:r>
+              <w:t>7.08</w:t>
+            </w:r>
+          </w:p>
         </w:tc>
         <w:tc>
           <w:tcPr>
             <w:tcW w:w="1207" w:type="dxa"/>
           </w:tcPr>
-          <w:p/>
+          <w:p>
+            <w:r>
+              <w:t>6.28</w:t>
+            </w:r>
+          </w:p>
         </w:tc>
         <w:tc>
           <w:tcPr>
             <w:tcW w:w="1240" w:type="dxa"/>
           </w:tcPr>
-          <w:p/>
+          <w:p>
+            <w:r>
+              <w:t>9.90</w:t>
+            </w:r>
+          </w:p>
         </w:tc>
         <w:tc>
           <w:tcPr>
             <w:tcW w:w="1390" w:type="dxa"/>
           </w:tcPr>
-          <w:p/>
+          <w:p>
+            <w:r>
+              <w:t>77,584</w:t>
+            </w:r>
+          </w:p>
         </w:tc>
         <w:tc>
           <w:tcPr>
             <w:tcW w:w="1390" w:type="dxa"/>
           </w:tcPr>
-          <w:p/>
+          <w:p>
+            <w:r>
+              <w:t>122,295</w:t>
+            </w:r>
+          </w:p>
         </w:tc>
         <w:tc>
           <w:tcPr>
             <w:tcW w:w="1154" w:type="dxa"/>
           </w:tcPr>
-          <w:p/>
+          <w:p>
+            <w:r>
+              <w:t>0.7287</w:t>
+            </w:r>
+          </w:p>
         </w:tc>
         <w:tc>
           <w:tcPr>
             <w:tcW w:w="1545" w:type="dxa"/>
           </w:tcPr>
-          <w:p/>
+          <w:p>
+            <w:r>
+              <w:t>+50.97</w:t>
+            </w:r>
+          </w:p>
         </w:tc>
         <w:tc>
           <w:tcPr>
             <w:tcW w:w="2060" w:type="dxa"/>
           </w:tcPr>
-          <w:p/>
+          <w:p>
+            <w:r>
+              <w:t>+17.55</w:t>
+            </w:r>
+          </w:p>
         </w:tc>
       </w:tr>
     </w:tbl>
@@ -4733,55 +5021,91 @@
           <w:tcPr>
             <w:tcW w:w="1283" w:type="dxa"/>
           </w:tcPr>
-          <w:p/>
+          <w:p>
+            <w:r>
+              <w:t>76.47</w:t>
+            </w:r>
+          </w:p>
         </w:tc>
         <w:tc>
           <w:tcPr>
             <w:tcW w:w="1183" w:type="dxa"/>
           </w:tcPr>
-          <w:p/>
+          <w:p>
+            <w:r>
+              <w:t>7.20</w:t>
+            </w:r>
+          </w:p>
         </w:tc>
         <w:tc>
           <w:tcPr>
             <w:tcW w:w="1207" w:type="dxa"/>
           </w:tcPr>
-          <w:p/>
+          <w:p>
+            <w:r>
+              <w:t>6.34</w:t>
+            </w:r>
+          </w:p>
         </w:tc>
         <w:tc>
           <w:tcPr>
             <w:tcW w:w="1240" w:type="dxa"/>
           </w:tcPr>
-          <w:p/>
+          <w:p>
+            <w:r>
+              <w:t>9.98</w:t>
+            </w:r>
+          </w:p>
         </w:tc>
         <w:tc>
           <w:tcPr>
             <w:tcW w:w="1390" w:type="dxa"/>
           </w:tcPr>
-          <w:p/>
+          <w:p>
+            <w:r>
+              <w:t>78,685</w:t>
+            </w:r>
+          </w:p>
         </w:tc>
         <w:tc>
           <w:tcPr>
             <w:tcW w:w="1390" w:type="dxa"/>
           </w:tcPr>
-          <w:p/>
+          <w:p>
+            <w:r>
+              <w:t>123,890</w:t>
+            </w:r>
+          </w:p>
         </w:tc>
         <w:tc>
           <w:tcPr>
             <w:tcW w:w="1154" w:type="dxa"/>
           </w:tcPr>
-          <w:p/>
+          <w:p>
+            <w:r>
+              <w:t>0.7234</w:t>
+            </w:r>
+          </w:p>
         </w:tc>
         <w:tc>
           <w:tcPr>
             <w:tcW w:w="1545" w:type="dxa"/>
           </w:tcPr>
-          <w:p/>
+          <w:p>
+            <w:r>
+              <w:t>+50.86</w:t>
+            </w:r>
+          </w:p>
         </w:tc>
         <w:tc>
           <w:tcPr>
             <w:tcW w:w="2060" w:type="dxa"/>
           </w:tcPr>
-          <w:p/>
+          <w:p>
+            <w:r>
+              <w:t>+17.50</w:t>
+            </w:r>
+          </w:p>
         </w:tc>
       </w:tr>
     </w:tbl>
@@ -5260,55 +5584,91 @@
           <w:tcPr>
             <w:tcW w:w="1283" w:type="dxa"/>
           </w:tcPr>
-          <w:p/>
+          <w:p>
+            <w:r>
+              <w:t>76.36</w:t>
+            </w:r>
+          </w:p>
         </w:tc>
         <w:tc>
           <w:tcPr>
             <w:tcW w:w="1183" w:type="dxa"/>
           </w:tcPr>
-          <w:p/>
+          <w:p>
+            <w:r>
+              <w:t>7.13</w:t>
+            </w:r>
+          </w:p>
         </w:tc>
         <w:tc>
           <w:tcPr>
             <w:tcW w:w="1207" w:type="dxa"/>
           </w:tcPr>
-          <w:p/>
+          <w:p>
+            <w:r>
+              <w:t>6.36</w:t>
+            </w:r>
+          </w:p>
         </w:tc>
         <w:tc>
           <w:tcPr>
             <w:tcW w:w="1240" w:type="dxa"/>
           </w:tcPr>
-          <w:p/>
+          <w:p>
+            <w:r>
+              <w:t>10.15</w:t>
+            </w:r>
+          </w:p>
         </w:tc>
         <w:tc>
           <w:tcPr>
             <w:tcW w:w="1390" w:type="dxa"/>
           </w:tcPr>
-          <w:p/>
+          <w:p>
+            <w:r>
+              <w:t>78,913</w:t>
+            </w:r>
+          </w:p>
         </w:tc>
         <w:tc>
           <w:tcPr>
             <w:tcW w:w="1390" w:type="dxa"/>
           </w:tcPr>
-          <w:p/>
+          <w:p>
+            <w:r>
+              <w:t>126,038</w:t>
+            </w:r>
+          </w:p>
         </w:tc>
         <w:tc>
           <w:tcPr>
             <w:tcW w:w="1154" w:type="dxa"/>
           </w:tcPr>
-          <w:p/>
+          <w:p>
+            <w:r>
+              <w:t>0.7123</w:t>
+            </w:r>
+          </w:p>
         </w:tc>
         <w:tc>
           <w:tcPr>
             <w:tcW w:w="1545" w:type="dxa"/>
           </w:tcPr>
-          <w:p/>
+          <w:p>
+            <w:r>
+              <w:t>+50.60</w:t>
+            </w:r>
+          </w:p>
         </w:tc>
         <w:tc>
           <w:tcPr>
             <w:tcW w:w="2060" w:type="dxa"/>
           </w:tcPr>
-          <w:p/>
+          <w:p>
+            <w:r>
+              <w:t>+17.50</w:t>
+            </w:r>
+          </w:p>
         </w:tc>
       </w:tr>
     </w:tbl>
@@ -5929,6 +6289,7 @@
   <w:style w:type="character" w:default="1" w:styleId="DefaultParagraphFont">
     <w:name w:val="Default Paragraph Font"/>
     <w:uiPriority w:val="1"/>
+    <w:semiHidden/>
     <w:unhideWhenUsed/>
   </w:style>
   <w:style w:type="table" w:default="1" w:styleId="TableNormal">

</xml_diff>